<commit_message>
Updated project with recent changes
</commit_message>
<xml_diff>
--- a/House-Price-Analysis-And-Prediction/Report.docx
+++ b/House-Price-Analysis-And-Prediction/Report.docx
@@ -1,7 +1,60 @@
 
 <file path=word/document.xml><?xml version="1.0" encoding="utf-8"?>
-<w:document xmlns:wpc="http://schemas.microsoft.com/office/word/2010/wordprocessingCanvas" xmlns:cx="http://schemas.microsoft.com/office/drawing/2014/chartex" xmlns:cx1="http://schemas.microsoft.com/office/drawing/2015/9/8/chartex" xmlns:cx2="http://schemas.microsoft.com/office/drawing/2015/10/21/chartex" xmlns:cx3="http://schemas.microsoft.com/office/drawing/2016/5/9/chartex" xmlns:cx4="http://schemas.microsoft.com/office/drawing/2016/5/10/chartex" xmlns:cx5="http://schemas.microsoft.com/office/drawing/2016/5/11/chartex" xmlns:cx6="http://schemas.microsoft.com/office/drawing/2016/5/12/chartex" xmlns:cx7="http://schemas.microsoft.com/office/drawing/2016/5/13/chartex" xmlns:cx8="http://schemas.microsoft.com/office/drawing/2016/5/14/chartex" xmlns:mc="http://schemas.openxmlformats.org/markup-compatibility/2006" xmlns:aink="http://schemas.microsoft.com/office/drawing/2016/ink" xmlns:am3d="http://schemas.microsoft.com/office/drawing/2017/model3d" xmlns:o="urn:schemas-microsoft-com:office:office" xmlns:oel="http://schemas.microsoft.com/office/2019/extlst" xmlns:r="http://schemas.openxmlformats.org/officeDocument/2006/relationships" xmlns:m="http://schemas.openxmlformats.org/officeDocument/2006/math" xmlns:v="urn:schemas-microsoft-com:vml" xmlns:wp14="http://schemas.microsoft.com/office/word/2010/wordprocessingDrawing" xmlns:wp="http://schemas.openxmlformats.org/drawingml/2006/wordprocessingDrawing" xmlns:w10="urn:schemas-microsoft-com:office:word" xmlns:w="http://schemas.openxmlformats.org/wordprocessingml/2006/main" xmlns:w14="http://schemas.microsoft.com/office/word/2010/wordml" xmlns:w15="http://schemas.microsoft.com/office/word/2012/wordml" xmlns:w16cex="http://schemas.microsoft.com/office/word/2018/wordml/cex" xmlns:w16cid="http://schemas.microsoft.com/office/word/2016/wordml/cid" xmlns:w16="http://schemas.microsoft.com/office/word/2018/wordml" xmlns:w16du="http://schemas.microsoft.com/office/word/2023/wordml/word16du" xmlns:w16sdtdh="http://schemas.microsoft.com/office/word/2020/wordml/sdtdatahash" xmlns:w16se="http://schemas.microsoft.com/office/word/2015/wordml/symex" xmlns:wpg="http://schemas.microsoft.com/office/word/2010/wordprocessingGroup" xmlns:wpi="http://schemas.microsoft.com/office/word/2010/wordprocessingInk" xmlns:wne="http://schemas.microsoft.com/office/word/2006/wordml" xmlns:wps="http://schemas.microsoft.com/office/word/2010/wordprocessingShape" mc:Ignorable="w14 w15 w16se w16cid w16 w16cex w16sdtdh w16du wp14">
+<w:document xmlns:wpc="http://schemas.microsoft.com/office/word/2010/wordprocessingCanvas" xmlns:cx="http://schemas.microsoft.com/office/drawing/2014/chartex" xmlns:cx1="http://schemas.microsoft.com/office/drawing/2015/9/8/chartex" xmlns:cx2="http://schemas.microsoft.com/office/drawing/2015/10/21/chartex" xmlns:cx3="http://schemas.microsoft.com/office/drawing/2016/5/9/chartex" xmlns:cx4="http://schemas.microsoft.com/office/drawing/2016/5/10/chartex" xmlns:cx5="http://schemas.microsoft.com/office/drawing/2016/5/11/chartex" xmlns:cx6="http://schemas.microsoft.com/office/drawing/2016/5/12/chartex" xmlns:cx7="http://schemas.microsoft.com/office/drawing/2016/5/13/chartex" xmlns:cx8="http://schemas.microsoft.com/office/drawing/2016/5/14/chartex" xmlns:mc="http://schemas.openxmlformats.org/markup-compatibility/2006" xmlns:aink="http://schemas.microsoft.com/office/drawing/2016/ink" xmlns:am3d="http://schemas.microsoft.com/office/drawing/2017/model3d" xmlns:o="urn:schemas-microsoft-com:office:office" xmlns:r="http://schemas.openxmlformats.org/officeDocument/2006/relationships" xmlns:m="http://schemas.openxmlformats.org/officeDocument/2006/math" xmlns:v="urn:schemas-microsoft-com:vml" xmlns:wp14="http://schemas.microsoft.com/office/word/2010/wordprocessingDrawing" xmlns:wp="http://schemas.openxmlformats.org/drawingml/2006/wordprocessingDrawing" xmlns:w10="urn:schemas-microsoft-com:office:word" xmlns:w="http://schemas.openxmlformats.org/wordprocessingml/2006/main" xmlns:w14="http://schemas.microsoft.com/office/word/2010/wordml" xmlns:w15="http://schemas.microsoft.com/office/word/2012/wordml" xmlns:w16cex="http://schemas.microsoft.com/office/word/2018/wordml/cex" xmlns:w16cid="http://schemas.microsoft.com/office/word/2016/wordml/cid" xmlns:w16="http://schemas.microsoft.com/office/word/2018/wordml" xmlns:w16sdtdh="http://schemas.microsoft.com/office/word/2020/wordml/sdtdatahash" xmlns:w16se="http://schemas.microsoft.com/office/word/2015/wordml/symex" xmlns:wpg="http://schemas.microsoft.com/office/word/2010/wordprocessingGroup" xmlns:wpi="http://schemas.microsoft.com/office/word/2010/wordprocessingInk" xmlns:wne="http://schemas.microsoft.com/office/word/2006/wordml" xmlns:wps="http://schemas.microsoft.com/office/word/2010/wordprocessingShape" mc:Ignorable="w14 w15 w16se w16cid w16 w16cex w16sdtdh wp14">
   <w:body>
+    <w:p>
+      <w:pPr>
+        <w:rPr>
+          <w:rFonts w:ascii="Bierstadt Display" w:hAnsi="Bierstadt Display" w:cs="Aharoni"/>
+          <w:b/>
+          <w:bCs/>
+          <w:sz w:val="56"/>
+          <w:szCs w:val="56"/>
+        </w:rPr>
+      </w:pPr>
+      <w:r>
+        <w:rPr>
+          <w:rFonts w:ascii="Bierstadt Display" w:hAnsi="Bierstadt Display" w:cs="Aharoni"/>
+          <w:b/>
+          <w:bCs/>
+          <w:sz w:val="56"/>
+          <w:szCs w:val="56"/>
+        </w:rPr>
+        <w:t>Name M Abdul Wasay (BSCS7th A)</w:t>
+      </w:r>
+    </w:p>
+    <w:p>
+      <w:pPr>
+        <w:rPr>
+          <w:rFonts w:ascii="Bierstadt Display" w:hAnsi="Bierstadt Display" w:cs="Aharoni"/>
+          <w:b/>
+          <w:bCs/>
+          <w:sz w:val="56"/>
+          <w:szCs w:val="56"/>
+        </w:rPr>
+      </w:pPr>
+      <w:r>
+        <w:rPr>
+          <w:rFonts w:ascii="Bierstadt Display" w:hAnsi="Bierstadt Display" w:cs="Aharoni"/>
+          <w:b/>
+          <w:bCs/>
+          <w:sz w:val="56"/>
+          <w:szCs w:val="56"/>
+        </w:rPr>
+        <w:t>Roll No (S23-0618)</w:t>
+      </w:r>
+    </w:p>
+    <w:p>
+      <w:pPr>
+        <w:rPr>
+          <w:rFonts w:ascii="Bierstadt Display" w:hAnsi="Bierstadt Display" w:cs="Aharoni"/>
+          <w:b/>
+          <w:bCs/>
+          <w:sz w:val="56"/>
+          <w:szCs w:val="56"/>
+        </w:rPr>
+      </w:pPr>
+    </w:p>
     <w:p>
       <w:pPr>
         <w:rPr>
@@ -313,6 +366,7 @@
           <w:sz w:val="32"/>
           <w:szCs w:val="32"/>
         </w:rPr>
+        <w:lastRenderedPageBreak/>
         <w:t>Used scatter plots and box plots to visualize outliers in numerical features.</w:t>
       </w:r>
     </w:p>
@@ -367,7 +421,6 @@
           <w:sz w:val="32"/>
           <w:szCs w:val="32"/>
         </w:rPr>
-        <w:lastRenderedPageBreak/>
         <w:t>Analyze the Distribution of House Prices</w:t>
       </w:r>
     </w:p>
@@ -699,6 +752,7 @@
           <w:sz w:val="32"/>
           <w:szCs w:val="32"/>
         </w:rPr>
+        <w:lastRenderedPageBreak/>
         <w:t>Model Training and Evaluation</w:t>
       </w:r>
     </w:p>
@@ -765,7 +819,6 @@
           <w:sz w:val="32"/>
           <w:szCs w:val="32"/>
         </w:rPr>
-        <w:lastRenderedPageBreak/>
         <w:t>Evaluated models using mean absolute error, mean squared error, and R-squared metrics.</w:t>
       </w:r>
     </w:p>
@@ -944,7 +997,7 @@
 </file>
 
 <file path=word/numbering.xml><?xml version="1.0" encoding="utf-8"?>
-<w:numbering xmlns:wpc="http://schemas.microsoft.com/office/word/2010/wordprocessingCanvas" xmlns:cx="http://schemas.microsoft.com/office/drawing/2014/chartex" xmlns:cx1="http://schemas.microsoft.com/office/drawing/2015/9/8/chartex" xmlns:cx2="http://schemas.microsoft.com/office/drawing/2015/10/21/chartex" xmlns:cx3="http://schemas.microsoft.com/office/drawing/2016/5/9/chartex" xmlns:cx4="http://schemas.microsoft.com/office/drawing/2016/5/10/chartex" xmlns:cx5="http://schemas.microsoft.com/office/drawing/2016/5/11/chartex" xmlns:cx6="http://schemas.microsoft.com/office/drawing/2016/5/12/chartex" xmlns:cx7="http://schemas.microsoft.com/office/drawing/2016/5/13/chartex" xmlns:cx8="http://schemas.microsoft.com/office/drawing/2016/5/14/chartex" xmlns:mc="http://schemas.openxmlformats.org/markup-compatibility/2006" xmlns:aink="http://schemas.microsoft.com/office/drawing/2016/ink" xmlns:am3d="http://schemas.microsoft.com/office/drawing/2017/model3d" xmlns:o="urn:schemas-microsoft-com:office:office" xmlns:oel="http://schemas.microsoft.com/office/2019/extlst" xmlns:r="http://schemas.openxmlformats.org/officeDocument/2006/relationships" xmlns:m="http://schemas.openxmlformats.org/officeDocument/2006/math" xmlns:v="urn:schemas-microsoft-com:vml" xmlns:wp14="http://schemas.microsoft.com/office/word/2010/wordprocessingDrawing" xmlns:wp="http://schemas.openxmlformats.org/drawingml/2006/wordprocessingDrawing" xmlns:w10="urn:schemas-microsoft-com:office:word" xmlns:w="http://schemas.openxmlformats.org/wordprocessingml/2006/main" xmlns:w14="http://schemas.microsoft.com/office/word/2010/wordml" xmlns:w15="http://schemas.microsoft.com/office/word/2012/wordml" xmlns:w16cex="http://schemas.microsoft.com/office/word/2018/wordml/cex" xmlns:w16cid="http://schemas.microsoft.com/office/word/2016/wordml/cid" xmlns:w16="http://schemas.microsoft.com/office/word/2018/wordml" xmlns:w16du="http://schemas.microsoft.com/office/word/2023/wordml/word16du" xmlns:w16sdtdh="http://schemas.microsoft.com/office/word/2020/wordml/sdtdatahash" xmlns:w16se="http://schemas.microsoft.com/office/word/2015/wordml/symex" xmlns:wpg="http://schemas.microsoft.com/office/word/2010/wordprocessingGroup" xmlns:wpi="http://schemas.microsoft.com/office/word/2010/wordprocessingInk" xmlns:wne="http://schemas.microsoft.com/office/word/2006/wordml" xmlns:wps="http://schemas.microsoft.com/office/word/2010/wordprocessingShape" mc:Ignorable="w14 w15 w16se w16cid w16 w16cex w16sdtdh w16du wp14">
+<w:numbering xmlns:wpc="http://schemas.microsoft.com/office/word/2010/wordprocessingCanvas" xmlns:cx="http://schemas.microsoft.com/office/drawing/2014/chartex" xmlns:cx1="http://schemas.microsoft.com/office/drawing/2015/9/8/chartex" xmlns:cx2="http://schemas.microsoft.com/office/drawing/2015/10/21/chartex" xmlns:cx3="http://schemas.microsoft.com/office/drawing/2016/5/9/chartex" xmlns:cx4="http://schemas.microsoft.com/office/drawing/2016/5/10/chartex" xmlns:cx5="http://schemas.microsoft.com/office/drawing/2016/5/11/chartex" xmlns:cx6="http://schemas.microsoft.com/office/drawing/2016/5/12/chartex" xmlns:cx7="http://schemas.microsoft.com/office/drawing/2016/5/13/chartex" xmlns:cx8="http://schemas.microsoft.com/office/drawing/2016/5/14/chartex" xmlns:mc="http://schemas.openxmlformats.org/markup-compatibility/2006" xmlns:aink="http://schemas.microsoft.com/office/drawing/2016/ink" xmlns:am3d="http://schemas.microsoft.com/office/drawing/2017/model3d" xmlns:o="urn:schemas-microsoft-com:office:office" xmlns:r="http://schemas.openxmlformats.org/officeDocument/2006/relationships" xmlns:m="http://schemas.openxmlformats.org/officeDocument/2006/math" xmlns:v="urn:schemas-microsoft-com:vml" xmlns:wp14="http://schemas.microsoft.com/office/word/2010/wordprocessingDrawing" xmlns:wp="http://schemas.openxmlformats.org/drawingml/2006/wordprocessingDrawing" xmlns:w10="urn:schemas-microsoft-com:office:word" xmlns:w="http://schemas.openxmlformats.org/wordprocessingml/2006/main" xmlns:w14="http://schemas.microsoft.com/office/word/2010/wordml" xmlns:w15="http://schemas.microsoft.com/office/word/2012/wordml" xmlns:w16cex="http://schemas.microsoft.com/office/word/2018/wordml/cex" xmlns:w16cid="http://schemas.microsoft.com/office/word/2016/wordml/cid" xmlns:w16="http://schemas.microsoft.com/office/word/2018/wordml" xmlns:w16sdtdh="http://schemas.microsoft.com/office/word/2020/wordml/sdtdatahash" xmlns:w16se="http://schemas.microsoft.com/office/word/2015/wordml/symex" xmlns:wpg="http://schemas.microsoft.com/office/word/2010/wordprocessingGroup" xmlns:wpi="http://schemas.microsoft.com/office/word/2010/wordprocessingInk" xmlns:wne="http://schemas.microsoft.com/office/word/2006/wordml" xmlns:wps="http://schemas.microsoft.com/office/word/2010/wordprocessingShape" mc:Ignorable="w14 w15 w16se w16cid w16 w16cex w16sdtdh wp14">
   <w:abstractNum w:abstractNumId="0" w15:restartNumberingAfterBreak="0">
     <w:nsid w:val="049D2249"/>
     <w:multiLevelType w:val="hybridMultilevel"/>
@@ -3827,77 +3880,77 @@
       </w:rPr>
     </w:lvl>
   </w:abstractNum>
-  <w:num w:numId="1" w16cid:durableId="983198467">
+  <w:num w:numId="1">
     <w:abstractNumId w:val="18"/>
   </w:num>
-  <w:num w:numId="2" w16cid:durableId="1804695798">
+  <w:num w:numId="2">
     <w:abstractNumId w:val="3"/>
   </w:num>
-  <w:num w:numId="3" w16cid:durableId="772359530">
+  <w:num w:numId="3">
     <w:abstractNumId w:val="14"/>
   </w:num>
-  <w:num w:numId="4" w16cid:durableId="1164392185">
+  <w:num w:numId="4">
     <w:abstractNumId w:val="8"/>
   </w:num>
-  <w:num w:numId="5" w16cid:durableId="590088531">
+  <w:num w:numId="5">
     <w:abstractNumId w:val="9"/>
   </w:num>
-  <w:num w:numId="6" w16cid:durableId="1342781883">
+  <w:num w:numId="6">
     <w:abstractNumId w:val="15"/>
   </w:num>
-  <w:num w:numId="7" w16cid:durableId="1194806028">
+  <w:num w:numId="7">
     <w:abstractNumId w:val="19"/>
   </w:num>
-  <w:num w:numId="8" w16cid:durableId="1285036314">
+  <w:num w:numId="8">
     <w:abstractNumId w:val="10"/>
   </w:num>
-  <w:num w:numId="9" w16cid:durableId="2116822219">
+  <w:num w:numId="9">
     <w:abstractNumId w:val="1"/>
   </w:num>
-  <w:num w:numId="10" w16cid:durableId="1385107089">
+  <w:num w:numId="10">
     <w:abstractNumId w:val="7"/>
   </w:num>
-  <w:num w:numId="11" w16cid:durableId="1138382262">
+  <w:num w:numId="11">
     <w:abstractNumId w:val="21"/>
   </w:num>
-  <w:num w:numId="12" w16cid:durableId="600577290">
+  <w:num w:numId="12">
     <w:abstractNumId w:val="13"/>
   </w:num>
-  <w:num w:numId="13" w16cid:durableId="742725452">
+  <w:num w:numId="13">
     <w:abstractNumId w:val="20"/>
   </w:num>
-  <w:num w:numId="14" w16cid:durableId="769009474">
+  <w:num w:numId="14">
     <w:abstractNumId w:val="11"/>
   </w:num>
-  <w:num w:numId="15" w16cid:durableId="1708791352">
+  <w:num w:numId="15">
     <w:abstractNumId w:val="2"/>
   </w:num>
-  <w:num w:numId="16" w16cid:durableId="144275134">
+  <w:num w:numId="16">
     <w:abstractNumId w:val="5"/>
   </w:num>
-  <w:num w:numId="17" w16cid:durableId="1791893282">
+  <w:num w:numId="17">
     <w:abstractNumId w:val="0"/>
   </w:num>
-  <w:num w:numId="18" w16cid:durableId="167254602">
+  <w:num w:numId="18">
     <w:abstractNumId w:val="4"/>
   </w:num>
-  <w:num w:numId="19" w16cid:durableId="1135291099">
+  <w:num w:numId="19">
     <w:abstractNumId w:val="17"/>
   </w:num>
-  <w:num w:numId="20" w16cid:durableId="324867991">
+  <w:num w:numId="20">
     <w:abstractNumId w:val="6"/>
   </w:num>
-  <w:num w:numId="21" w16cid:durableId="1283851612">
+  <w:num w:numId="21">
     <w:abstractNumId w:val="12"/>
   </w:num>
-  <w:num w:numId="22" w16cid:durableId="123231380">
+  <w:num w:numId="22">
     <w:abstractNumId w:val="16"/>
   </w:num>
 </w:numbering>
 </file>
 
 <file path=word/styles.xml><?xml version="1.0" encoding="utf-8"?>
-<w:styles xmlns:mc="http://schemas.openxmlformats.org/markup-compatibility/2006" xmlns:r="http://schemas.openxmlformats.org/officeDocument/2006/relationships" xmlns:w="http://schemas.openxmlformats.org/wordprocessingml/2006/main" xmlns:w14="http://schemas.microsoft.com/office/word/2010/wordml" xmlns:w15="http://schemas.microsoft.com/office/word/2012/wordml" xmlns:w16cex="http://schemas.microsoft.com/office/word/2018/wordml/cex" xmlns:w16cid="http://schemas.microsoft.com/office/word/2016/wordml/cid" xmlns:w16="http://schemas.microsoft.com/office/word/2018/wordml" xmlns:w16du="http://schemas.microsoft.com/office/word/2023/wordml/word16du" xmlns:w16sdtdh="http://schemas.microsoft.com/office/word/2020/wordml/sdtdatahash" xmlns:w16se="http://schemas.microsoft.com/office/word/2015/wordml/symex" mc:Ignorable="w14 w15 w16se w16cid w16 w16cex w16sdtdh w16du">
+<w:styles xmlns:mc="http://schemas.openxmlformats.org/markup-compatibility/2006" xmlns:r="http://schemas.openxmlformats.org/officeDocument/2006/relationships" xmlns:w="http://schemas.openxmlformats.org/wordprocessingml/2006/main" xmlns:w14="http://schemas.microsoft.com/office/word/2010/wordml" xmlns:w15="http://schemas.microsoft.com/office/word/2012/wordml" xmlns:w16cex="http://schemas.microsoft.com/office/word/2018/wordml/cex" xmlns:w16cid="http://schemas.microsoft.com/office/word/2016/wordml/cid" xmlns:w16="http://schemas.microsoft.com/office/word/2018/wordml" xmlns:w16sdtdh="http://schemas.microsoft.com/office/word/2020/wordml/sdtdatahash" xmlns:w16se="http://schemas.microsoft.com/office/word/2015/wordml/symex" mc:Ignorable="w14 w15 w16se w16cid w16 w16cex w16sdtdh">
   <w:docDefaults>
     <w:rPrDefault>
       <w:rPr>

</xml_diff>